<commit_message>
Alpha 0.0.4 - Actualizada documentacion
</commit_message>
<xml_diff>
--- a/Documentacion/Informe de Pruebas - 0.0.3.docx
+++ b/Documentacion/Informe de Pruebas - 0.0.3.docx
@@ -9604,14 +9604,6 @@
         <w:tblW w:w="8886" w:type="dxa"/>
         <w:tblLayout w:type="fixed"/>
         <w:tblLook w:val="04A0" w:firstRow="1" w:lastRow="0" w:firstColumn="1" w:lastColumn="0" w:noHBand="0" w:noVBand="1"/>
-        <w:tblPrChange w:id="0" w:author="Luis Pichon" w:date="2021-10-26T10:40:00Z">
-          <w:tblPr>
-            <w:tblStyle w:val="Tablaconcuadrcula"/>
-            <w:tblW w:w="8886" w:type="dxa"/>
-            <w:tblLayout w:type="fixed"/>
-            <w:tblLook w:val="04A0" w:firstRow="1" w:lastRow="0" w:firstColumn="1" w:lastColumn="0" w:noHBand="0" w:noVBand="1"/>
-          </w:tblPr>
-        </w:tblPrChange>
       </w:tblPr>
       <w:tblGrid>
         <w:gridCol w:w="825"/>
@@ -9619,27 +9611,12 @@
         <w:gridCol w:w="2562"/>
         <w:gridCol w:w="1749"/>
         <w:gridCol w:w="1890"/>
-        <w:tblGridChange w:id="1">
-          <w:tblGrid>
-            <w:gridCol w:w="360"/>
-            <w:gridCol w:w="360"/>
-            <w:gridCol w:w="360"/>
-            <w:gridCol w:w="360"/>
-            <w:gridCol w:w="360"/>
-          </w:tblGrid>
-        </w:tblGridChange>
       </w:tblGrid>
       <w:tr>
         <w:tc>
           <w:tcPr>
             <w:tcW w:w="8886" w:type="dxa"/>
             <w:gridSpan w:val="5"/>
-            <w:tcPrChange w:id="2" w:author="Luis Pichon" w:date="2021-10-26T10:40:00Z">
-              <w:tcPr>
-                <w:tcW w:w="0" w:type="auto"/>
-                <w:gridSpan w:val="5"/>
-              </w:tcPr>
-            </w:tcPrChange>
           </w:tcPr>
           <w:p>
             <w:pPr>
@@ -9649,6 +9626,7 @@
                 <w:bCs/>
               </w:rPr>
             </w:pPr>
+            <w:bookmarkStart w:id="0" w:name="_GoBack" w:colFirst="0" w:colLast="1"/>
             <w:r>
               <w:rPr>
                 <w:b/>
@@ -9663,11 +9641,6 @@
         <w:tc>
           <w:tcPr>
             <w:tcW w:w="825" w:type="dxa"/>
-            <w:tcPrChange w:id="3" w:author="Luis Pichon" w:date="2021-10-26T10:40:00Z">
-              <w:tcPr>
-                <w:tcW w:w="0" w:type="auto"/>
-              </w:tcPr>
-            </w:tcPrChange>
           </w:tcPr>
           <w:p>
             <w:pPr>
@@ -9688,11 +9661,6 @@
         <w:tc>
           <w:tcPr>
             <w:tcW w:w="1860" w:type="dxa"/>
-            <w:tcPrChange w:id="4" w:author="Luis Pichon" w:date="2021-10-26T10:40:00Z">
-              <w:tcPr>
-                <w:tcW w:w="0" w:type="auto"/>
-              </w:tcPr>
-            </w:tcPrChange>
           </w:tcPr>
           <w:p>
             <w:pPr>
@@ -9713,11 +9681,6 @@
         <w:tc>
           <w:tcPr>
             <w:tcW w:w="2562" w:type="dxa"/>
-            <w:tcPrChange w:id="5" w:author="Luis Pichon" w:date="2021-10-26T10:40:00Z">
-              <w:tcPr>
-                <w:tcW w:w="0" w:type="auto"/>
-              </w:tcPr>
-            </w:tcPrChange>
           </w:tcPr>
           <w:p>
             <w:pPr>
@@ -9738,11 +9701,6 @@
         <w:tc>
           <w:tcPr>
             <w:tcW w:w="1749" w:type="dxa"/>
-            <w:tcPrChange w:id="6" w:author="Luis Pichon" w:date="2021-10-26T10:40:00Z">
-              <w:tcPr>
-                <w:tcW w:w="0" w:type="auto"/>
-              </w:tcPr>
-            </w:tcPrChange>
           </w:tcPr>
           <w:p>
             <w:pPr>
@@ -9763,11 +9721,6 @@
         <w:tc>
           <w:tcPr>
             <w:tcW w:w="1890" w:type="dxa"/>
-            <w:tcPrChange w:id="7" w:author="Luis Pichon" w:date="2021-10-26T10:40:00Z">
-              <w:tcPr>
-                <w:tcW w:w="0" w:type="auto"/>
-              </w:tcPr>
-            </w:tcPrChange>
           </w:tcPr>
           <w:p>
             <w:pPr>
@@ -9797,11 +9750,6 @@
         <w:tc>
           <w:tcPr>
             <w:tcW w:w="825" w:type="dxa"/>
-            <w:tcPrChange w:id="8" w:author="Luis Pichon" w:date="2021-10-26T10:40:00Z">
-              <w:tcPr>
-                <w:tcW w:w="0" w:type="auto"/>
-              </w:tcPr>
-            </w:tcPrChange>
           </w:tcPr>
           <w:p>
             <w:r>
@@ -9812,11 +9760,6 @@
         <w:tc>
           <w:tcPr>
             <w:tcW w:w="1860" w:type="dxa"/>
-            <w:tcPrChange w:id="9" w:author="Luis Pichon" w:date="2021-10-26T10:40:00Z">
-              <w:tcPr>
-                <w:tcW w:w="0" w:type="auto"/>
-              </w:tcPr>
-            </w:tcPrChange>
           </w:tcPr>
           <w:p>
             <w:pPr>
@@ -9843,11 +9786,6 @@
         <w:tc>
           <w:tcPr>
             <w:tcW w:w="2562" w:type="dxa"/>
-            <w:tcPrChange w:id="10" w:author="Luis Pichon" w:date="2021-10-26T10:40:00Z">
-              <w:tcPr>
-                <w:tcW w:w="0" w:type="auto"/>
-              </w:tcPr>
-            </w:tcPrChange>
           </w:tcPr>
           <w:p>
             <w:pPr>
@@ -9878,11 +9816,6 @@
         <w:tc>
           <w:tcPr>
             <w:tcW w:w="1749" w:type="dxa"/>
-            <w:tcPrChange w:id="11" w:author="Luis Pichon" w:date="2021-10-26T10:40:00Z">
-              <w:tcPr>
-                <w:tcW w:w="0" w:type="auto"/>
-              </w:tcPr>
-            </w:tcPrChange>
           </w:tcPr>
           <w:p>
             <w:pPr>
@@ -9911,11 +9844,6 @@
         <w:tc>
           <w:tcPr>
             <w:tcW w:w="1890" w:type="dxa"/>
-            <w:tcPrChange w:id="12" w:author="Luis Pichon" w:date="2021-10-26T10:40:00Z">
-              <w:tcPr>
-                <w:tcW w:w="0" w:type="auto"/>
-              </w:tcPr>
-            </w:tcPrChange>
           </w:tcPr>
           <w:p>
             <w:pPr>
@@ -9949,11 +9877,6 @@
         <w:tc>
           <w:tcPr>
             <w:tcW w:w="825" w:type="dxa"/>
-            <w:tcPrChange w:id="13" w:author="Luis Pichon" w:date="2021-10-26T10:40:00Z">
-              <w:tcPr>
-                <w:tcW w:w="0" w:type="auto"/>
-              </w:tcPr>
-            </w:tcPrChange>
           </w:tcPr>
           <w:p>
             <w:r>
@@ -9964,11 +9887,6 @@
         <w:tc>
           <w:tcPr>
             <w:tcW w:w="1860" w:type="dxa"/>
-            <w:tcPrChange w:id="14" w:author="Luis Pichon" w:date="2021-10-26T10:40:00Z">
-              <w:tcPr>
-                <w:tcW w:w="0" w:type="auto"/>
-              </w:tcPr>
-            </w:tcPrChange>
           </w:tcPr>
           <w:p>
             <w:pPr>
@@ -9995,11 +9913,6 @@
         <w:tc>
           <w:tcPr>
             <w:tcW w:w="2562" w:type="dxa"/>
-            <w:tcPrChange w:id="15" w:author="Luis Pichon" w:date="2021-10-26T10:40:00Z">
-              <w:tcPr>
-                <w:tcW w:w="0" w:type="auto"/>
-              </w:tcPr>
-            </w:tcPrChange>
           </w:tcPr>
           <w:p>
             <w:pPr>
@@ -10030,11 +9943,6 @@
         <w:tc>
           <w:tcPr>
             <w:tcW w:w="1749" w:type="dxa"/>
-            <w:tcPrChange w:id="16" w:author="Luis Pichon" w:date="2021-10-26T10:40:00Z">
-              <w:tcPr>
-                <w:tcW w:w="0" w:type="auto"/>
-              </w:tcPr>
-            </w:tcPrChange>
           </w:tcPr>
           <w:p>
             <w:pPr>
@@ -10063,11 +9971,6 @@
         <w:tc>
           <w:tcPr>
             <w:tcW w:w="1890" w:type="dxa"/>
-            <w:tcPrChange w:id="17" w:author="Luis Pichon" w:date="2021-10-26T10:40:00Z">
-              <w:tcPr>
-                <w:tcW w:w="0" w:type="auto"/>
-              </w:tcPr>
-            </w:tcPrChange>
           </w:tcPr>
           <w:p>
             <w:pPr>
@@ -10274,11 +10177,6 @@
         <w:tc>
           <w:tcPr>
             <w:tcW w:w="825" w:type="dxa"/>
-            <w:tcPrChange w:id="18" w:author="Luis Pichon" w:date="2021-10-26T10:40:00Z">
-              <w:tcPr>
-                <w:tcW w:w="0" w:type="auto"/>
-              </w:tcPr>
-            </w:tcPrChange>
           </w:tcPr>
           <w:p>
             <w:r>
@@ -10289,11 +10187,6 @@
         <w:tc>
           <w:tcPr>
             <w:tcW w:w="1860" w:type="dxa"/>
-            <w:tcPrChange w:id="19" w:author="Luis Pichon" w:date="2021-10-26T10:40:00Z">
-              <w:tcPr>
-                <w:tcW w:w="0" w:type="auto"/>
-              </w:tcPr>
-            </w:tcPrChange>
           </w:tcPr>
           <w:p>
             <w:pPr>
@@ -10322,11 +10215,6 @@
         <w:tc>
           <w:tcPr>
             <w:tcW w:w="2562" w:type="dxa"/>
-            <w:tcPrChange w:id="20" w:author="Luis Pichon" w:date="2021-10-26T10:40:00Z">
-              <w:tcPr>
-                <w:tcW w:w="0" w:type="auto"/>
-              </w:tcPr>
-            </w:tcPrChange>
           </w:tcPr>
           <w:p>
             <w:pPr>
@@ -10355,11 +10243,6 @@
         <w:tc>
           <w:tcPr>
             <w:tcW w:w="1749" w:type="dxa"/>
-            <w:tcPrChange w:id="21" w:author="Luis Pichon" w:date="2021-10-26T10:40:00Z">
-              <w:tcPr>
-                <w:tcW w:w="0" w:type="auto"/>
-              </w:tcPr>
-            </w:tcPrChange>
           </w:tcPr>
           <w:p>
             <w:pPr>
@@ -10388,16 +10271,11 @@
         <w:tc>
           <w:tcPr>
             <w:tcW w:w="1890" w:type="dxa"/>
-            <w:tcPrChange w:id="22" w:author="Luis Pichon" w:date="2021-10-26T10:40:00Z">
-              <w:tcPr>
-                <w:tcW w:w="0" w:type="auto"/>
-              </w:tcPr>
-            </w:tcPrChange>
-          </w:tcPr>
-          <w:p>
-            <w:pPr>
-              <w:rPr>
-                <w:del w:id="23" w:author="Luis Pichon" w:date="2021-10-26T11:02:00Z"/>
+          </w:tcPr>
+          <w:p>
+            <w:pPr>
+              <w:rPr>
+                <w:del w:id="1" w:author="Luis Pichon" w:date="2021-10-26T11:02:00Z"/>
                 <w:rFonts w:eastAsia="Calibri" w:cs="Arial"/>
                 <w:b/>
                 <w:bCs/>
@@ -10421,7 +10299,7 @@
           <w:p>
             <w:pPr>
               <w:rPr>
-                <w:del w:id="24" w:author="Luis Pichon" w:date="2021-10-26T11:03:00Z"/>
+                <w:del w:id="2" w:author="Luis Pichon" w:date="2021-10-26T11:03:00Z"/>
                 <w:rFonts w:eastAsia="Calibri" w:cs="Arial"/>
                 <w:b/>
                 <w:bCs/>
@@ -10475,11 +10353,6 @@
         <w:tc>
           <w:tcPr>
             <w:tcW w:w="825" w:type="dxa"/>
-            <w:tcPrChange w:id="25" w:author="Luis Pichon" w:date="2021-10-26T10:40:00Z">
-              <w:tcPr>
-                <w:tcW w:w="0" w:type="auto"/>
-              </w:tcPr>
-            </w:tcPrChange>
           </w:tcPr>
           <w:p>
             <w:r>
@@ -10491,11 +10364,6 @@
         <w:tc>
           <w:tcPr>
             <w:tcW w:w="1860" w:type="dxa"/>
-            <w:tcPrChange w:id="26" w:author="Luis Pichon" w:date="2021-10-26T10:40:00Z">
-              <w:tcPr>
-                <w:tcW w:w="0" w:type="auto"/>
-              </w:tcPr>
-            </w:tcPrChange>
           </w:tcPr>
           <w:p>
             <w:pPr>
@@ -10524,11 +10392,6 @@
         <w:tc>
           <w:tcPr>
             <w:tcW w:w="2562" w:type="dxa"/>
-            <w:tcPrChange w:id="27" w:author="Luis Pichon" w:date="2021-10-26T10:40:00Z">
-              <w:tcPr>
-                <w:tcW w:w="0" w:type="auto"/>
-              </w:tcPr>
-            </w:tcPrChange>
           </w:tcPr>
           <w:p>
             <w:pPr>
@@ -10559,11 +10422,6 @@
         <w:tc>
           <w:tcPr>
             <w:tcW w:w="1749" w:type="dxa"/>
-            <w:tcPrChange w:id="28" w:author="Luis Pichon" w:date="2021-10-26T10:40:00Z">
-              <w:tcPr>
-                <w:tcW w:w="0" w:type="auto"/>
-              </w:tcPr>
-            </w:tcPrChange>
           </w:tcPr>
           <w:p>
             <w:pPr>
@@ -10592,11 +10450,6 @@
         <w:tc>
           <w:tcPr>
             <w:tcW w:w="1890" w:type="dxa"/>
-            <w:tcPrChange w:id="29" w:author="Luis Pichon" w:date="2021-10-26T10:40:00Z">
-              <w:tcPr>
-                <w:tcW w:w="0" w:type="auto"/>
-              </w:tcPr>
-            </w:tcPrChange>
           </w:tcPr>
           <w:p>
             <w:pPr>
@@ -10826,11 +10679,6 @@
         <w:tc>
           <w:tcPr>
             <w:tcW w:w="825" w:type="dxa"/>
-            <w:tcPrChange w:id="30" w:author="Luis Pichon" w:date="2021-10-26T10:40:00Z">
-              <w:tcPr>
-                <w:tcW w:w="0" w:type="auto"/>
-              </w:tcPr>
-            </w:tcPrChange>
           </w:tcPr>
           <w:p>
             <w:r>
@@ -10841,11 +10689,6 @@
         <w:tc>
           <w:tcPr>
             <w:tcW w:w="1860" w:type="dxa"/>
-            <w:tcPrChange w:id="31" w:author="Luis Pichon" w:date="2021-10-26T10:40:00Z">
-              <w:tcPr>
-                <w:tcW w:w="0" w:type="auto"/>
-              </w:tcPr>
-            </w:tcPrChange>
           </w:tcPr>
           <w:p>
             <w:pPr>
@@ -10874,11 +10717,6 @@
         <w:tc>
           <w:tcPr>
             <w:tcW w:w="2562" w:type="dxa"/>
-            <w:tcPrChange w:id="32" w:author="Luis Pichon" w:date="2021-10-26T10:40:00Z">
-              <w:tcPr>
-                <w:tcW w:w="0" w:type="auto"/>
-              </w:tcPr>
-            </w:tcPrChange>
           </w:tcPr>
           <w:p>
             <w:pPr>
@@ -10919,11 +10757,6 @@
         <w:tc>
           <w:tcPr>
             <w:tcW w:w="1749" w:type="dxa"/>
-            <w:tcPrChange w:id="33" w:author="Luis Pichon" w:date="2021-10-26T10:40:00Z">
-              <w:tcPr>
-                <w:tcW w:w="0" w:type="auto"/>
-              </w:tcPr>
-            </w:tcPrChange>
           </w:tcPr>
           <w:p>
             <w:pPr>
@@ -10952,11 +10785,6 @@
         <w:tc>
           <w:tcPr>
             <w:tcW w:w="1890" w:type="dxa"/>
-            <w:tcPrChange w:id="34" w:author="Luis Pichon" w:date="2021-10-26T10:40:00Z">
-              <w:tcPr>
-                <w:tcW w:w="0" w:type="auto"/>
-              </w:tcPr>
-            </w:tcPrChange>
           </w:tcPr>
           <w:p>
             <w:pPr>
@@ -10990,11 +10818,6 @@
         <w:tc>
           <w:tcPr>
             <w:tcW w:w="825" w:type="dxa"/>
-            <w:tcPrChange w:id="35" w:author="Luis Pichon" w:date="2021-10-26T10:40:00Z">
-              <w:tcPr>
-                <w:tcW w:w="0" w:type="auto"/>
-              </w:tcPr>
-            </w:tcPrChange>
           </w:tcPr>
           <w:p>
             <w:r>
@@ -11005,11 +10828,6 @@
         <w:tc>
           <w:tcPr>
             <w:tcW w:w="1860" w:type="dxa"/>
-            <w:tcPrChange w:id="36" w:author="Luis Pichon" w:date="2021-10-26T10:40:00Z">
-              <w:tcPr>
-                <w:tcW w:w="0" w:type="auto"/>
-              </w:tcPr>
-            </w:tcPrChange>
           </w:tcPr>
           <w:p>
             <w:pPr>
@@ -11038,11 +10856,6 @@
         <w:tc>
           <w:tcPr>
             <w:tcW w:w="2562" w:type="dxa"/>
-            <w:tcPrChange w:id="37" w:author="Luis Pichon" w:date="2021-10-26T10:40:00Z">
-              <w:tcPr>
-                <w:tcW w:w="0" w:type="auto"/>
-              </w:tcPr>
-            </w:tcPrChange>
           </w:tcPr>
           <w:p>
             <w:pPr>
@@ -11073,11 +10886,6 @@
         <w:tc>
           <w:tcPr>
             <w:tcW w:w="1749" w:type="dxa"/>
-            <w:tcPrChange w:id="38" w:author="Luis Pichon" w:date="2021-10-26T10:40:00Z">
-              <w:tcPr>
-                <w:tcW w:w="0" w:type="auto"/>
-              </w:tcPr>
-            </w:tcPrChange>
           </w:tcPr>
           <w:p>
             <w:pPr>
@@ -11106,11 +10914,6 @@
         <w:tc>
           <w:tcPr>
             <w:tcW w:w="1890" w:type="dxa"/>
-            <w:tcPrChange w:id="39" w:author="Luis Pichon" w:date="2021-10-26T10:40:00Z">
-              <w:tcPr>
-                <w:tcW w:w="0" w:type="auto"/>
-              </w:tcPr>
-            </w:tcPrChange>
           </w:tcPr>
           <w:p>
             <w:pPr>
@@ -11137,6 +10940,7 @@
           </w:p>
         </w:tc>
       </w:tr>
+      <w:bookmarkEnd w:id="0"/>
     </w:tbl>
     <w:p>
       <w:pPr>
@@ -11884,8 +11688,8 @@
         </w:rPr>
         <w:t>Total pruebas: 25 Procedimientos</w:t>
       </w:r>
-      <w:bookmarkStart w:id="40" w:name="OLE_LINK3"/>
-      <w:bookmarkStart w:id="41" w:name="OLE_LINK4"/>
+      <w:bookmarkStart w:id="3" w:name="OLE_LINK3"/>
+      <w:bookmarkStart w:id="4" w:name="OLE_LINK4"/>
     </w:p>
     <w:tbl>
       <w:tblPr>
@@ -11912,9 +11716,9 @@
                 <w:lang w:val="es-MX"/>
               </w:rPr>
             </w:pPr>
-            <w:bookmarkStart w:id="42" w:name="OLE_LINK1"/>
-            <w:bookmarkStart w:id="43" w:name="OLE_LINK2"/>
-            <w:bookmarkStart w:id="44" w:name="OLE_LINK8"/>
+            <w:bookmarkStart w:id="5" w:name="OLE_LINK1"/>
+            <w:bookmarkStart w:id="6" w:name="OLE_LINK2"/>
+            <w:bookmarkStart w:id="7" w:name="OLE_LINK8"/>
             <w:r>
               <w:rPr>
                 <w:lang w:val="es-MX"/>
@@ -18235,9 +18039,9 @@
           </w:p>
         </w:tc>
       </w:tr>
-      <w:bookmarkEnd w:id="42"/>
-      <w:bookmarkEnd w:id="43"/>
-      <w:bookmarkEnd w:id="44"/>
+      <w:bookmarkEnd w:id="5"/>
+      <w:bookmarkEnd w:id="6"/>
+      <w:bookmarkEnd w:id="7"/>
     </w:tbl>
     <w:p>
       <w:pPr>
@@ -18247,8 +18051,8 @@
         </w:rPr>
       </w:pPr>
     </w:p>
-    <w:bookmarkEnd w:id="40"/>
-    <w:bookmarkEnd w:id="41"/>
+    <w:bookmarkEnd w:id="3"/>
+    <w:bookmarkEnd w:id="4"/>
     <w:p>
       <w:pPr>
         <w:pStyle w:val="Prrafodelista"/>
@@ -18300,8 +18104,6 @@
         </w:rPr>
         <w:t>, ver el archivo testReport</w:t>
       </w:r>
-      <w:bookmarkStart w:id="45" w:name="_GoBack"/>
-      <w:bookmarkEnd w:id="45"/>
       <w:r>
         <w:rPr>
           <w:lang w:val="es-MX"/>

</xml_diff>